<commit_message>
Amplitudes réelles (dB) : CSV v3 +6 colonnes F1_db–F6_db, graphiques avec hauteurs proportionnelles à l'énergie spectrale, 40 images régénérées
</commit_message>
<xml_diff>
--- a/Versions-html-and-docx/section_cordes_v5.docx
+++ b/Versions-html-and-docx/section_cordes_v5.docx
@@ -9086,7 +9086,7 @@
       <w:r>
         <w:drawing>
           <wp:inline xmlns:a="http://schemas.openxmlformats.org/drawingml/2006/main" xmlns:pic="http://schemas.openxmlformats.org/drawingml/2006/picture">
-            <wp:extent cx="5943600" cy="2950842"/>
+            <wp:extent cx="5943600" cy="2946686"/>
             <wp:docPr id="2" name="Picture 2"/>
             <wp:cNvGraphicFramePr>
               <a:graphicFrameLocks noChangeAspect="1"/>
@@ -9107,7 +9107,7 @@
                   <pic:spPr>
                     <a:xfrm>
                       <a:off x="0" y="0"/>
-                      <a:ext cx="5943600" cy="2950842"/>
+                      <a:ext cx="5943600" cy="2946686"/>
                     </a:xfrm>
                     <a:prstGeom prst="rect"/>
                   </pic:spPr>
@@ -18100,7 +18100,7 @@
       <w:r>
         <w:drawing>
           <wp:inline xmlns:a="http://schemas.openxmlformats.org/drawingml/2006/main" xmlns:pic="http://schemas.openxmlformats.org/drawingml/2006/picture">
-            <wp:extent cx="5943600" cy="2938409"/>
+            <wp:extent cx="5943600" cy="2936347"/>
             <wp:docPr id="5" name="Picture 5"/>
             <wp:cNvGraphicFramePr>
               <a:graphicFrameLocks noChangeAspect="1"/>
@@ -18121,7 +18121,7 @@
                   <pic:spPr>
                     <a:xfrm>
                       <a:off x="0" y="0"/>
-                      <a:ext cx="5943600" cy="2938409"/>
+                      <a:ext cx="5943600" cy="2936347"/>
                     </a:xfrm>
                     <a:prstGeom prst="rect"/>
                   </pic:spPr>
@@ -27626,7 +27626,7 @@
       <w:r>
         <w:drawing>
           <wp:inline xmlns:a="http://schemas.openxmlformats.org/drawingml/2006/main" xmlns:pic="http://schemas.openxmlformats.org/drawingml/2006/picture">
-            <wp:extent cx="5943600" cy="2946686"/>
+            <wp:extent cx="5943600" cy="2942542"/>
             <wp:docPr id="8" name="Picture 8"/>
             <wp:cNvGraphicFramePr>
               <a:graphicFrameLocks noChangeAspect="1"/>
@@ -27647,7 +27647,7 @@
                   <pic:spPr>
                     <a:xfrm>
                       <a:off x="0" y="0"/>
-                      <a:ext cx="5943600" cy="2946686"/>
+                      <a:ext cx="5943600" cy="2942542"/>
                     </a:xfrm>
                     <a:prstGeom prst="rect"/>
                   </pic:spPr>
@@ -36576,7 +36576,7 @@
       <w:r>
         <w:drawing>
           <wp:inline xmlns:a="http://schemas.openxmlformats.org/drawingml/2006/main" xmlns:pic="http://schemas.openxmlformats.org/drawingml/2006/picture">
-            <wp:extent cx="5943600" cy="2946686"/>
+            <wp:extent cx="5943600" cy="2944613"/>
             <wp:docPr id="12" name="Picture 12"/>
             <wp:cNvGraphicFramePr>
               <a:graphicFrameLocks noChangeAspect="1"/>
@@ -36597,7 +36597,7 @@
                   <pic:spPr>
                     <a:xfrm>
                       <a:off x="0" y="0"/>
-                      <a:ext cx="5943600" cy="2946686"/>
+                      <a:ext cx="5943600" cy="2944613"/>
                     </a:xfrm>
                     <a:prstGeom prst="rect"/>
                   </pic:spPr>
@@ -41833,7 +41833,7 @@
       <w:r>
         <w:drawing>
           <wp:inline xmlns:a="http://schemas.openxmlformats.org/drawingml/2006/main" xmlns:pic="http://schemas.openxmlformats.org/drawingml/2006/picture">
-            <wp:extent cx="5943600" cy="2944613"/>
+            <wp:extent cx="5943600" cy="2940474"/>
             <wp:docPr id="17" name="Picture 17"/>
             <wp:cNvGraphicFramePr>
               <a:graphicFrameLocks noChangeAspect="1"/>
@@ -41854,7 +41854,7 @@
                   <pic:spPr>
                     <a:xfrm>
                       <a:off x="0" y="0"/>
-                      <a:ext cx="5943600" cy="2944613"/>
+                      <a:ext cx="5943600" cy="2940474"/>
                     </a:xfrm>
                     <a:prstGeom prst="rect"/>
                   </pic:spPr>

</xml_diff>

<commit_message>
Courbes en cloche avec BW -3dB réels (specenv): 49 images, bandwidths_3db.csv (533 profils), légende lower-left, document complet régénéré
</commit_message>
<xml_diff>
--- a/Versions-html-and-docx/section_cordes_v5.docx
+++ b/Versions-html-and-docx/section_cordes_v5.docx
@@ -9086,7 +9086,7 @@
       <w:r>
         <w:drawing>
           <wp:inline xmlns:a="http://schemas.openxmlformats.org/drawingml/2006/main" xmlns:pic="http://schemas.openxmlformats.org/drawingml/2006/picture">
-            <wp:extent cx="5943600" cy="2946686"/>
+            <wp:extent cx="5943600" cy="2944613"/>
             <wp:docPr id="2" name="Picture 2"/>
             <wp:cNvGraphicFramePr>
               <a:graphicFrameLocks noChangeAspect="1"/>
@@ -9107,7 +9107,7 @@
                   <pic:spPr>
                     <a:xfrm>
                       <a:off x="0" y="0"/>
-                      <a:ext cx="5943600" cy="2946686"/>
+                      <a:ext cx="5943600" cy="2944613"/>
                     </a:xfrm>
                     <a:prstGeom prst="rect"/>
                   </pic:spPr>
@@ -27626,7 +27626,7 @@
       <w:r>
         <w:drawing>
           <wp:inline xmlns:a="http://schemas.openxmlformats.org/drawingml/2006/main" xmlns:pic="http://schemas.openxmlformats.org/drawingml/2006/picture">
-            <wp:extent cx="5943600" cy="2942542"/>
+            <wp:extent cx="5943600" cy="2936347"/>
             <wp:docPr id="8" name="Picture 8"/>
             <wp:cNvGraphicFramePr>
               <a:graphicFrameLocks noChangeAspect="1"/>
@@ -27647,7 +27647,7 @@
                   <pic:spPr>
                     <a:xfrm>
                       <a:off x="0" y="0"/>
-                      <a:ext cx="5943600" cy="2942542"/>
+                      <a:ext cx="5943600" cy="2936347"/>
                     </a:xfrm>
                     <a:prstGeom prst="rect"/>
                   </pic:spPr>
@@ -27687,7 +27687,7 @@
       <w:r>
         <w:drawing>
           <wp:inline xmlns:a="http://schemas.openxmlformats.org/drawingml/2006/main" xmlns:pic="http://schemas.openxmlformats.org/drawingml/2006/picture">
-            <wp:extent cx="5943600" cy="2946686"/>
+            <wp:extent cx="5943600" cy="2942542"/>
             <wp:docPr id="9" name="Picture 9"/>
             <wp:cNvGraphicFramePr>
               <a:graphicFrameLocks noChangeAspect="1"/>
@@ -27708,7 +27708,7 @@
                   <pic:spPr>
                     <a:xfrm>
                       <a:off x="0" y="0"/>
-                      <a:ext cx="5943600" cy="2946686"/>
+                      <a:ext cx="5943600" cy="2942542"/>
                     </a:xfrm>
                     <a:prstGeom prst="rect"/>
                   </pic:spPr>
@@ -36576,7 +36576,7 @@
       <w:r>
         <w:drawing>
           <wp:inline xmlns:a="http://schemas.openxmlformats.org/drawingml/2006/main" xmlns:pic="http://schemas.openxmlformats.org/drawingml/2006/picture">
-            <wp:extent cx="5943600" cy="2944613"/>
+            <wp:extent cx="5943600" cy="2938409"/>
             <wp:docPr id="12" name="Picture 12"/>
             <wp:cNvGraphicFramePr>
               <a:graphicFrameLocks noChangeAspect="1"/>
@@ -36597,7 +36597,7 @@
                   <pic:spPr>
                     <a:xfrm>
                       <a:off x="0" y="0"/>
-                      <a:ext cx="5943600" cy="2944613"/>
+                      <a:ext cx="5943600" cy="2938409"/>
                     </a:xfrm>
                     <a:prstGeom prst="rect"/>
                   </pic:spPr>
@@ -41833,7 +41833,7 @@
       <w:r>
         <w:drawing>
           <wp:inline xmlns:a="http://schemas.openxmlformats.org/drawingml/2006/main" xmlns:pic="http://schemas.openxmlformats.org/drawingml/2006/picture">
-            <wp:extent cx="5943600" cy="2940474"/>
+            <wp:extent cx="5943600" cy="2936347"/>
             <wp:docPr id="17" name="Picture 17"/>
             <wp:cNvGraphicFramePr>
               <a:graphicFrameLocks noChangeAspect="1"/>
@@ -41854,7 +41854,7 @@
                   <pic:spPr>
                     <a:xfrm>
                       <a:off x="0" y="0"/>
-                      <a:ext cx="5943600" cy="2940474"/>
+                      <a:ext cx="5943600" cy="2936347"/>
                     </a:xfrm>
                     <a:prstGeom prst="rect"/>
                   </pic:spPr>

</xml_diff>

<commit_message>
Fp dynamique pour cordes+bois (compute_fp_from_specenv), losange Fp réduit de moitié, 49 images régénérées + document complet
</commit_message>
<xml_diff>
--- a/Versions-html-and-docx/section_cordes_v5.docx
+++ b/Versions-html-and-docx/section_cordes_v5.docx
@@ -9128,6 +9128,17 @@
         <w:t>Son plus doux, atténuation des harmoniques aigus. F1 peut descendre ou rester stable selon la sourdine. Timbre plus mat et intimiste.</w:t>
       </w:r>
     </w:p>
+    <w:p>
+      <w:r>
+        <w:rPr>
+          <w:b/>
+          <w:i w:val="0"/>
+          <w:color w:val="1B5E20"/>
+          <w:sz w:val="20"/>
+        </w:rPr>
+        <w:t>Fp (centroïde) = 1218 Hz</w:t>
+      </w:r>
+    </w:p>
     <w:p/>
     <w:p>
       <w:pPr>
@@ -9187,6 +9198,17 @@
           <w:sz w:val="20"/>
         </w:rPr>
         <w:t>Sourdine lourde en plomb. Amortissement maximum, son extrêmement étouffé. Utilisée en musique contemporaine pour effets timbraux extrêmes.</w:t>
+      </w:r>
+    </w:p>
+    <w:p>
+      <w:r>
+        <w:rPr>
+          <w:b/>
+          <w:i w:val="0"/>
+          <w:color w:val="1B5E20"/>
+          <w:sz w:val="20"/>
+        </w:rPr>
+        <w:t>Fp (centroïde) = 1345 Hz</w:t>
       </w:r>
     </w:p>
     <w:p/>
@@ -9262,6 +9284,17 @@
       </w:r>
     </w:p>
     <w:p>
+      <w:r>
+        <w:rPr>
+          <w:b/>
+          <w:i w:val="0"/>
+          <w:color w:val="1B5E20"/>
+          <w:sz w:val="20"/>
+        </w:rPr>
+        <w:t>Fp (centroïde) = 1300 Hz</w:t>
+      </w:r>
+    </w:p>
+    <w:p>
       <w:pPr>
         <w:pStyle w:val="Heading3"/>
       </w:pPr>
@@ -18142,6 +18175,17 @@
         <w:t>Son voilé, atténuation des partiels médiums. Timbre plus intimiste et introspectif.</w:t>
       </w:r>
     </w:p>
+    <w:p>
+      <w:r>
+        <w:rPr>
+          <w:b/>
+          <w:i w:val="0"/>
+          <w:color w:val="1B5E20"/>
+          <w:sz w:val="20"/>
+        </w:rPr>
+        <w:t>Fp (centroïde) = 1125 Hz</w:t>
+      </w:r>
+    </w:p>
     <w:p/>
     <w:p>
       <w:pPr>
@@ -18201,6 +18245,17 @@
           <w:sz w:val="20"/>
         </w:rPr>
         <w:t>Sourdine lourde. Amortissement maximal, utilisée pour les effets timbraux extrêmes.</w:t>
+      </w:r>
+    </w:p>
+    <w:p>
+      <w:r>
+        <w:rPr>
+          <w:b/>
+          <w:i w:val="0"/>
+          <w:color w:val="1B5E20"/>
+          <w:sz w:val="20"/>
+        </w:rPr>
+        <w:t>Fp (centroïde) = 1171 Hz</w:t>
       </w:r>
     </w:p>
     <w:p/>
@@ -18276,6 +18331,17 @@
       </w:r>
     </w:p>
     <w:p>
+      <w:r>
+        <w:rPr>
+          <w:b/>
+          <w:i w:val="0"/>
+          <w:color w:val="1B5E20"/>
+          <w:sz w:val="20"/>
+        </w:rPr>
+        <w:t>Fp (centroïde) = 1242 Hz</w:t>
+      </w:r>
+    </w:p>
+    <w:p>
       <w:pPr>
         <w:pStyle w:val="Heading3"/>
       </w:pPr>
@@ -27668,6 +27734,17 @@
         <w:t>F1 légèrement modifié. Son plus mat, projection réduite. Atténuation des harmoniques aigus.</w:t>
       </w:r>
     </w:p>
+    <w:p>
+      <w:r>
+        <w:rPr>
+          <w:b/>
+          <w:i w:val="0"/>
+          <w:color w:val="1B5E20"/>
+          <w:sz w:val="20"/>
+        </w:rPr>
+        <w:t>Fp (centroïde) = 1238 Hz</w:t>
+      </w:r>
+    </w:p>
     <w:p/>
     <w:p>
       <w:pPr>
@@ -27727,6 +27804,17 @@
           <w:sz w:val="20"/>
         </w:rPr>
         <w:t>Sourdine lourde. Amortissement maximal des partiels aigus.</w:t>
+      </w:r>
+    </w:p>
+    <w:p>
+      <w:r>
+        <w:rPr>
+          <w:b/>
+          <w:i w:val="0"/>
+          <w:color w:val="1B5E20"/>
+          <w:sz w:val="20"/>
+        </w:rPr>
+        <w:t>Fp (centroïde) = 1158 Hz</w:t>
       </w:r>
     </w:p>
     <w:p/>
@@ -27802,6 +27890,17 @@
       </w:r>
     </w:p>
     <w:p>
+      <w:r>
+        <w:rPr>
+          <w:b/>
+          <w:i w:val="0"/>
+          <w:color w:val="1B5E20"/>
+          <w:sz w:val="20"/>
+        </w:rPr>
+        <w:t>Fp (centroïde) = 1235 Hz</w:t>
+      </w:r>
+    </w:p>
+    <w:p>
       <w:pPr>
         <w:pStyle w:val="Heading3"/>
       </w:pPr>
@@ -36534,6 +36633,17 @@
           <w:sz w:val="20"/>
         </w:rPr>
         <w:t>Son très étouffé. La sourdine affecte principalement les harmoniques médiums.</w:t>
+      </w:r>
+    </w:p>
+    <w:p>
+      <w:r>
+        <w:rPr>
+          <w:b/>
+          <w:i w:val="0"/>
+          <w:color w:val="1B5E20"/>
+          <w:sz w:val="20"/>
+        </w:rPr>
+        <w:t>Fp (centroïde) = 1217 Hz</w:t>
       </w:r>
     </w:p>
     <w:p/>

</xml_diff>